<commit_message>
Add customer portal, Autopilot rebrand, and product manuals
Co-authored-by: capy-ai[bot] <230910855+capy-ai[bot]@users.noreply.github.com>
</commit_message>
<xml_diff>
--- a/affidexlab/new/docs/launch/DECAFLOW_BUSINESS_DEVELOPMENT_PLAYBOOK.docx
+++ b/affidexlab/new/docs/launch/DECAFLOW_BUSINESS_DEVELOPMENT_PLAYBOOK.docx
@@ -124,7 +124,6 @@
     </w:p>
     <w:p>
       <w:pPr>
-        <w:spacing w:before="80" w:after="80"/>
         <w:ind w:left="360"/>
       </w:pPr>
       <w:r>
@@ -222,7 +221,6 @@
     </w:p>
     <w:p>
       <w:pPr>
-        <w:spacing w:before="80" w:after="80"/>
         <w:ind w:left="360"/>
       </w:pPr>
       <w:r>
@@ -317,7 +315,6 @@
     </w:p>
     <w:p>
       <w:pPr>
-        <w:spacing w:before="80" w:after="80"/>
         <w:ind w:left="360"/>
       </w:pPr>
       <w:r>
@@ -399,7 +396,6 @@
     </w:p>
     <w:p>
       <w:pPr>
-        <w:spacing w:before="80" w:after="80"/>
         <w:ind w:left="360"/>
       </w:pPr>
       <w:r>
@@ -478,7 +474,6 @@
     </w:p>
     <w:p>
       <w:pPr>
-        <w:spacing w:before="80" w:after="80"/>
         <w:ind w:left="360"/>
       </w:pPr>
       <w:r>
@@ -586,7 +581,6 @@
     </w:p>
     <w:p>
       <w:pPr>
-        <w:spacing w:before="80" w:after="80"/>
         <w:ind w:left="360"/>
       </w:pPr>
       <w:r>
@@ -611,7 +605,6 @@
     </w:p>
     <w:p>
       <w:pPr>
-        <w:spacing w:before="80" w:after="80"/>
         <w:ind w:left="360"/>
       </w:pPr>
       <w:r>
@@ -636,7 +629,6 @@
     </w:p>
     <w:p>
       <w:pPr>
-        <w:spacing w:before="80" w:after="80"/>
         <w:ind w:left="360"/>
       </w:pPr>
       <w:r>
@@ -1140,7 +1132,6 @@
     </w:p>
     <w:p>
       <w:pPr>
-        <w:spacing w:before="80" w:after="80"/>
         <w:ind w:left="360"/>
       </w:pPr>
       <w:r>
@@ -1157,7 +1148,6 @@
     </w:p>
     <w:p>
       <w:pPr>
-        <w:spacing w:before="80" w:after="80"/>
         <w:ind w:left="360"/>
       </w:pPr>
       <w:r>
@@ -1485,7 +1475,6 @@
     </w:p>
     <w:p>
       <w:pPr>
-        <w:spacing w:before="80" w:after="80"/>
         <w:ind w:left="360"/>
       </w:pPr>
       <w:r>
@@ -1502,7 +1491,6 @@
     </w:p>
     <w:p>
       <w:pPr>
-        <w:spacing w:before="80" w:after="80"/>
         <w:ind w:left="360"/>
       </w:pPr>
       <w:r>
@@ -1593,7 +1581,6 @@
     </w:p>
     <w:p>
       <w:pPr>
-        <w:spacing w:before="80" w:after="80"/>
         <w:ind w:left="360"/>
       </w:pPr>
       <w:r>
@@ -1610,7 +1597,6 @@
     </w:p>
     <w:p>
       <w:pPr>
-        <w:spacing w:before="80" w:after="80"/>
         <w:ind w:left="360"/>
       </w:pPr>
       <w:r>
@@ -1741,7 +1727,6 @@
     </w:p>
     <w:p>
       <w:pPr>
-        <w:spacing w:before="80" w:after="80"/>
         <w:ind w:left="360"/>
       </w:pPr>
       <w:r>
@@ -1758,7 +1743,6 @@
     </w:p>
     <w:p>
       <w:pPr>
-        <w:spacing w:before="80" w:after="80"/>
         <w:ind w:left="360"/>
       </w:pPr>
       <w:r>
@@ -1804,7 +1788,6 @@
     </w:p>
     <w:p>
       <w:pPr>
-        <w:spacing w:before="80" w:after="80"/>
         <w:ind w:left="360"/>
       </w:pPr>
       <w:r>
@@ -1834,7 +1817,6 @@
     </w:p>
     <w:p>
       <w:pPr>
-        <w:spacing w:before="80" w:after="80"/>
         <w:ind w:left="360"/>
       </w:pPr>
       <w:r>
@@ -1851,7 +1833,6 @@
     </w:p>
     <w:p>
       <w:pPr>
-        <w:spacing w:before="80" w:after="80"/>
         <w:ind w:left="360"/>
       </w:pPr>
       <w:r>
@@ -1914,6 +1895,201 @@
     <w:p>
       <w:r>
         <w:t>The best commercial motion remains design-partner selling. The message is stronger now because the product has real ingestion and enterprise controls, but the honest wedge is still: “help us tune DecaFlow’s proprietary risk graph against your real cases,” not “we already have every risky wallet in the world.”</w:t>
+      </w:r>
+    </w:p>
+    <w:p>
+      <w:pPr>
+        <w:pStyle w:val="Heading1"/>
+      </w:pPr>
+      <w:r>
+        <w:t>Product playbook and rebrand — 2026-08-09</w:t>
+      </w:r>
+    </w:p>
+    <w:p>
+      <w:pPr>
+        <w:pStyle w:val="Heading2"/>
+      </w:pPr>
+      <w:r>
+        <w:t>Rebrand</w:t>
+      </w:r>
+    </w:p>
+    <w:p>
+      <w:r>
+        <w:t xml:space="preserve">"Agents" is now sold as </w:t>
+      </w:r>
+      <w:r>
+        <w:rPr>
+          <w:b/>
+        </w:rPr>
+        <w:t>DecaFlow Autopilot — Agentic Compliance</w:t>
+      </w:r>
+      <w:r>
+        <w:t>. Same URL (/agents), stronger name. Pitch: "Autopilot turns risk checks into accountable workflows — and earns the right to automate by learning your team's own decisions."</w:t>
+      </w:r>
+    </w:p>
+    <w:p>
+      <w:pPr>
+        <w:pStyle w:val="Heading2"/>
+      </w:pPr>
+      <w:r>
+        <w:t>Step-by-step per product (what the customer actually does)</w:t>
+      </w:r>
+    </w:p>
+    <w:p>
+      <w:pPr>
+        <w:pStyle w:val="ListBullet"/>
+      </w:pPr>
+      <w:r>
+        <w:rPr>
+          <w:b/>
+        </w:rPr>
+        <w:t>Verify API</w:t>
+      </w:r>
+      <w:r>
+        <w:t xml:space="preserve">: pay → receive API key → call </w:t>
+      </w:r>
+      <w:r>
+        <w:rPr>
+          <w:rFonts w:ascii="Courier New" w:hAnsi="Courier New"/>
+          <w:sz w:val="18"/>
+        </w:rPr>
+        <w:t>POST /v1/verify/check</w:t>
+      </w:r>
+      <w:r>
+        <w:t xml:space="preserve"> from their backend → get approve/review/reject with evidence. Demo on the site is clearly a preview; the API is the product.</w:t>
+      </w:r>
+    </w:p>
+    <w:p>
+      <w:pPr>
+        <w:pStyle w:val="ListBullet"/>
+      </w:pPr>
+      <w:r>
+        <w:rPr>
+          <w:b/>
+        </w:rPr>
+        <w:t>Compliance</w:t>
+      </w:r>
+      <w:r>
+        <w:t>: pay → onboarding call → their team screens wallets and records decisions with a full evidence trail.</w:t>
+      </w:r>
+    </w:p>
+    <w:p>
+      <w:pPr>
+        <w:pStyle w:val="ListBullet"/>
+      </w:pPr>
+      <w:r>
+        <w:rPr>
+          <w:b/>
+        </w:rPr>
+        <w:t>Shield</w:t>
+      </w:r>
+      <w:r>
+        <w:t>: pay → send us chains, contract addresses, alert emails, and contract ABIs → monitoring live in 15-minute cycles with alerts, incidents, playbooks, and ABI-aware privileged-function findings.</w:t>
+      </w:r>
+    </w:p>
+    <w:p>
+      <w:pPr>
+        <w:pStyle w:val="ListBullet"/>
+      </w:pPr>
+      <w:r>
+        <w:rPr>
+          <w:b/>
+        </w:rPr>
+        <w:t>Autopilot</w:t>
+      </w:r>
+      <w:r>
+        <w:t>: pay → org account and scoped API key → set rules → review queue → approve automation for proven patterns only.</w:t>
+      </w:r>
+    </w:p>
+    <w:p>
+      <w:pPr>
+        <w:pStyle w:val="ListBullet"/>
+      </w:pPr>
+      <w:r>
+        <w:rPr>
+          <w:b/>
+        </w:rPr>
+        <w:t>Institutional/RWA</w:t>
+      </w:r>
+      <w:r>
+        <w:t>: issuer engagement → org API key with attestation/check scopes → they record ZK-KYC attestations, run investor checks before every mint/transfer, and deploy DecaFlow's pre-audited templates with their own multisig and counsel.</w:t>
+      </w:r>
+    </w:p>
+    <w:p>
+      <w:pPr>
+        <w:pStyle w:val="ListBullet"/>
+      </w:pPr>
+      <w:r>
+        <w:rPr>
+          <w:b/>
+        </w:rPr>
+        <w:t>Audit</w:t>
+      </w:r>
+      <w:r>
+        <w:t>: pay a package → scoping call → report → upsell Shield ("the audit is a snapshot; Shield is the watchtower").</w:t>
+      </w:r>
+    </w:p>
+    <w:p>
+      <w:pPr>
+        <w:pStyle w:val="Heading2"/>
+      </w:pPr>
+      <w:r>
+        <w:t>Customer login story (use in demos)</w:t>
+      </w:r>
+    </w:p>
+    <w:p>
+      <w:r>
+        <w:t>Every customer gets passwordless login at decaflow.xyz/login: email link → account page → team, API keys, all products in one place. Buying another product uses the same account email, so access accumulates under one organization.</w:t>
+      </w:r>
+    </w:p>
+    <w:p>
+      <w:pPr>
+        <w:pStyle w:val="Heading2"/>
+      </w:pPr>
+      <w:r>
+        <w:t>What BD owns operationally</w:t>
+      </w:r>
+    </w:p>
+    <w:p>
+      <w:pPr>
+        <w:pStyle w:val="ListBullet"/>
+      </w:pPr>
+      <w:r>
+        <w:t xml:space="preserve">Confirm the product is </w:t>
+      </w:r>
+      <w:r>
+        <w:rPr>
+          <w:rFonts w:ascii="Courier New" w:hAnsi="Courier New"/>
+          <w:sz w:val="18"/>
+        </w:rPr>
+        <w:t>accepting customers</w:t>
+      </w:r>
+      <w:r>
+        <w:t xml:space="preserve"> in founder-control before campaigns.</w:t>
+      </w:r>
+    </w:p>
+    <w:p>
+      <w:pPr>
+        <w:pStyle w:val="ListBullet"/>
+      </w:pPr>
+      <w:r>
+        <w:t>Route paid enquiries to Compliance Ops same day; nothing paid waits more than 24 hours.</w:t>
+      </w:r>
+    </w:p>
+    <w:p>
+      <w:pPr>
+        <w:pStyle w:val="ListBullet"/>
+      </w:pPr>
+      <w:r>
+        <w:t>For Shield pilots, collect: chain, addresses, labels, admin addresses, alert recipients, ABIs, critical events.</w:t>
+      </w:r>
+    </w:p>
+    <w:p>
+      <w:pPr>
+        <w:pStyle w:val="ListBullet"/>
+      </w:pPr>
+      <w:r>
+        <w:t>For Institutional, position DecaFlow as the compliance layer for the issuer's counsel-approved offering — never as the issuer's lawyer.</w:t>
       </w:r>
     </w:p>
     <w:sectPr>

</xml_diff>

<commit_message>
Update launch docs for interactive customer dashboards
Co-authored-by: capy-ai[bot] <230910855+capy-ai[bot]@users.noreply.github.com>
</commit_message>
<xml_diff>
--- a/affidexlab/new/docs/launch/DECAFLOW_BUSINESS_DEVELOPMENT_PLAYBOOK.docx
+++ b/affidexlab/new/docs/launch/DECAFLOW_BUSINESS_DEVELOPMENT_PLAYBOOK.docx
@@ -12,7 +12,7 @@
     </w:p>
     <w:p>
       <w:pPr>
-        <w:pStyle w:val="Heading1"/>
+        <w:pStyle w:val="Heading2"/>
       </w:pPr>
       <w:r>
         <w:t>What BD is selling</w:t>
@@ -25,7 +25,7 @@
     </w:p>
     <w:p>
       <w:pPr>
-        <w:pStyle w:val="Heading1"/>
+        <w:pStyle w:val="Heading2"/>
       </w:pPr>
       <w:r>
         <w:t>Product positioning</w:t>
@@ -33,7 +33,7 @@
     </w:p>
     <w:p>
       <w:pPr>
-        <w:pStyle w:val="Heading2"/>
+        <w:pStyle w:val="Heading3"/>
       </w:pPr>
       <w:r>
         <w:t>DecaFlow Verify</w:t>
@@ -124,12 +124,9 @@
     </w:p>
     <w:p>
       <w:pPr>
-        <w:ind w:left="360"/>
-      </w:pPr>
-      <w:r>
-        <w:rPr>
-          <w:i/>
-        </w:rPr>
+        <w:pStyle w:val="Quote"/>
+      </w:pPr>
+      <w:r>
         <w:t>DecaFlow Verify gives teams a wallet-risk decision layer and is moving toward a proprietary DecaFlow risk graph built from sanctions labels, mixer/darknet/scam intelligence, transaction graph exposure, and analyst feedback.</w:t>
       </w:r>
     </w:p>
@@ -146,7 +143,7 @@
     </w:p>
     <w:p>
       <w:pPr>
-        <w:pStyle w:val="Heading2"/>
+        <w:pStyle w:val="Heading3"/>
       </w:pPr>
       <w:r>
         <w:t>DecaFlow Compliance</w:t>
@@ -221,18 +218,15 @@
     </w:p>
     <w:p>
       <w:pPr>
-        <w:ind w:left="360"/>
-      </w:pPr>
-      <w:r>
-        <w:rPr>
-          <w:i/>
-        </w:rPr>
+        <w:pStyle w:val="Quote"/>
+      </w:pPr>
+      <w:r>
         <w:t>Compliance teams do not just need a score. They need a workflow: what triggered the alert, who reviewed it, what decision was made, and what evidence supports that decision. DecaFlow turns wallet-risk screening into an operational process.</w:t>
       </w:r>
     </w:p>
     <w:p>
       <w:pPr>
-        <w:pStyle w:val="Heading2"/>
+        <w:pStyle w:val="Heading3"/>
       </w:pPr>
       <w:r>
         <w:t>DecaFlow Shield</w:t>
@@ -315,12 +309,9 @@
     </w:p>
     <w:p>
       <w:pPr>
-        <w:ind w:left="360"/>
-      </w:pPr>
-      <w:r>
-        <w:rPr>
-          <w:i/>
-        </w:rPr>
+        <w:pStyle w:val="Quote"/>
+      </w:pPr>
+      <w:r>
         <w:t>An audit is a snapshot. Shield is the ongoing watchtower after deployment. It tracks contract activity, creates alerts, opens incidents, and gives teams a response workflow.</w:t>
       </w:r>
     </w:p>
@@ -337,7 +328,7 @@
     </w:p>
     <w:p>
       <w:pPr>
-        <w:pStyle w:val="Heading2"/>
+        <w:pStyle w:val="Heading3"/>
       </w:pPr>
       <w:r>
         <w:t>DecaFlow Agents</w:t>
@@ -396,18 +387,15 @@
     </w:p>
     <w:p>
       <w:pPr>
-        <w:ind w:left="360"/>
-      </w:pPr>
-      <w:r>
-        <w:rPr>
-          <w:i/>
-        </w:rPr>
+        <w:pStyle w:val="Quote"/>
+      </w:pPr>
+      <w:r>
         <w:t>DecaFlow Agents do not blindly freeze accounts. They learn from repeated human decisions and ask for approval before automating a pattern. That gives speed without losing accountability.</w:t>
       </w:r>
     </w:p>
     <w:p>
       <w:pPr>
-        <w:pStyle w:val="Heading2"/>
+        <w:pStyle w:val="Heading3"/>
       </w:pPr>
       <w:r>
         <w:t>DecaFlow Institutional / RWA</w:t>
@@ -474,12 +462,9 @@
     </w:p>
     <w:p>
       <w:pPr>
-        <w:ind w:left="360"/>
-      </w:pPr>
-      <w:r>
-        <w:rPr>
-          <w:i/>
-        </w:rPr>
+        <w:pStyle w:val="Quote"/>
+      </w:pPr>
+      <w:r>
         <w:t>DecaFlow Institutional provides the technical layer for compliant tokenized assets: identity registry, transfer rules, risk oracle, forced-transfer controls, and issuer tooling.</w:t>
       </w:r>
     </w:p>
@@ -496,7 +481,7 @@
     </w:p>
     <w:p>
       <w:pPr>
-        <w:pStyle w:val="Heading1"/>
+        <w:pStyle w:val="Heading2"/>
       </w:pPr>
       <w:r>
         <w:t>Best prospects right now</w:t>
@@ -560,7 +545,7 @@
     </w:p>
     <w:p>
       <w:pPr>
-        <w:pStyle w:val="Heading1"/>
+        <w:pStyle w:val="Heading2"/>
       </w:pPr>
       <w:r>
         <w:t>Outreach message templates</w:t>
@@ -568,7 +553,7 @@
     </w:p>
     <w:p>
       <w:pPr>
-        <w:pStyle w:val="Heading2"/>
+        <w:pStyle w:val="Heading3"/>
       </w:pPr>
       <w:r>
         <w:t>Shield outreach</w:t>
@@ -581,18 +566,15 @@
     </w:p>
     <w:p>
       <w:pPr>
-        <w:ind w:left="360"/>
-      </w:pPr>
-      <w:r>
-        <w:rPr>
-          <w:i/>
-        </w:rPr>
+        <w:pStyle w:val="Quote"/>
+      </w:pPr>
+      <w:r>
         <w:t>Hi [Name], I saw [Project] is live on [chain]. A one-time audit is useful, but most incidents happen after deployment through admin changes, integrations, compromised keys, or suspicious fund flows. DecaFlow Shield is our continuous monitoring layer: it watches contracts, creates alerts, opens incidents, and gives your team a response workflow. We are onboarding design partners now. Would you be open to a 20-minute call this week?</w:t>
       </w:r>
     </w:p>
     <w:p>
       <w:pPr>
-        <w:pStyle w:val="Heading2"/>
+        <w:pStyle w:val="Heading3"/>
       </w:pPr>
       <w:r>
         <w:t>Verify/Compliance outreach</w:t>
@@ -605,18 +587,15 @@
     </w:p>
     <w:p>
       <w:pPr>
-        <w:ind w:left="360"/>
-      </w:pPr>
-      <w:r>
-        <w:rPr>
-          <w:i/>
-        </w:rPr>
+        <w:pStyle w:val="Quote"/>
+      </w:pPr>
+      <w:r>
         <w:t>Hi [Name], DecaFlow is building a wallet-risk and compliance workflow platform for crypto teams. The goal is not just a score; it is an approve/review/reject decision, evidence, audit trail, and human review process. We are expanding our proprietary DecaFlow risk graph and onboarding beta partners. Would it be useful to test this against your onboarding or transaction review flow?</w:t>
       </w:r>
     </w:p>
     <w:p>
       <w:pPr>
-        <w:pStyle w:val="Heading2"/>
+        <w:pStyle w:val="Heading3"/>
       </w:pPr>
       <w:r>
         <w:t>RWA outreach</w:t>
@@ -629,18 +608,15 @@
     </w:p>
     <w:p>
       <w:pPr>
-        <w:ind w:left="360"/>
-      </w:pPr>
-      <w:r>
-        <w:rPr>
-          <w:i/>
-        </w:rPr>
+        <w:pStyle w:val="Quote"/>
+      </w:pPr>
+      <w:r>
         <w:t>Hi [Name], DecaFlow is building institutional infrastructure for RWA issuers: identity registry, compliant transfer rules, wallet eligibility checks, and issuer tooling. We are not offering one-click securities issuance; we work with teams during the legal and technical design phase so the contract rules match counsel-approved requirements. Are you exploring tokenized assets this quarter?</w:t>
       </w:r>
     </w:p>
     <w:p>
       <w:pPr>
-        <w:pStyle w:val="Heading1"/>
+        <w:pStyle w:val="Heading2"/>
       </w:pPr>
       <w:r>
         <w:t>Discovery questions</w:t>
@@ -648,7 +624,7 @@
     </w:p>
     <w:p>
       <w:pPr>
-        <w:pStyle w:val="Heading2"/>
+        <w:pStyle w:val="Heading3"/>
       </w:pPr>
       <w:r>
         <w:t>For Verify/Compliance</w:t>
@@ -712,7 +688,7 @@
     </w:p>
     <w:p>
       <w:pPr>
-        <w:pStyle w:val="Heading2"/>
+        <w:pStyle w:val="Heading3"/>
       </w:pPr>
       <w:r>
         <w:t>For Shield</w:t>
@@ -768,7 +744,7 @@
     </w:p>
     <w:p>
       <w:pPr>
-        <w:pStyle w:val="Heading2"/>
+        <w:pStyle w:val="Heading3"/>
       </w:pPr>
       <w:r>
         <w:t>For RWA</w:t>
@@ -832,7 +808,7 @@
     </w:p>
     <w:p>
       <w:pPr>
-        <w:pStyle w:val="Heading1"/>
+        <w:pStyle w:val="Heading2"/>
       </w:pPr>
       <w:r>
         <w:t>Pricing guidance for beta</w:t>
@@ -885,7 +861,7 @@
     </w:p>
     <w:p>
       <w:pPr>
-        <w:pStyle w:val="Heading1"/>
+        <w:pStyle w:val="Heading2"/>
       </w:pPr>
       <w:r>
         <w:t>What BD must not promise</w:t>
@@ -991,7 +967,7 @@
     </w:p>
     <w:p>
       <w:pPr>
-        <w:pStyle w:val="Heading1"/>
+        <w:pStyle w:val="Heading2"/>
       </w:pPr>
       <w:r>
         <w:t>Alchemy webhook setup for BD/customer calls</w:t>
@@ -1041,7 +1017,7 @@
     </w:p>
     <w:p>
       <w:pPr>
-        <w:pStyle w:val="Heading1"/>
+        <w:pStyle w:val="Heading2"/>
       </w:pPr>
       <w:r>
         <w:t>Sales stages</w:t>
@@ -1119,7 +1095,7 @@
     </w:p>
     <w:p>
       <w:pPr>
-        <w:pStyle w:val="Heading1"/>
+        <w:pStyle w:val="Heading2"/>
       </w:pPr>
       <w:r>
         <w:t>Best immediate launch motion</w:t>
@@ -1132,12 +1108,9 @@
     </w:p>
     <w:p>
       <w:pPr>
-        <w:ind w:left="360"/>
-      </w:pPr>
-      <w:r>
-        <w:rPr>
-          <w:i/>
-        </w:rPr>
+        <w:pStyle w:val="Quote"/>
+      </w:pPr>
+      <w:r>
         <w:t>DecaFlow Public Beta: proprietary wallet-risk intelligence, continuous contract monitoring, and compliance workflow automation for Web3 teams.</w:t>
       </w:r>
     </w:p>
@@ -1148,12 +1121,9 @@
     </w:p>
     <w:p>
       <w:pPr>
-        <w:ind w:left="360"/>
-      </w:pPr>
-      <w:r>
-        <w:rPr>
-          <w:i/>
-        </w:rPr>
+        <w:pStyle w:val="Quote"/>
+      </w:pPr>
+      <w:r>
         <w:t>Join as a design partner.</w:t>
       </w:r>
     </w:p>
@@ -1164,7 +1134,7 @@
     </w:p>
     <w:p>
       <w:pPr>
-        <w:pStyle w:val="Heading1"/>
+        <w:pStyle w:val="Heading2"/>
       </w:pPr>
       <w:r>
         <w:t>Launch readiness re-review — 2026-08-08</w:t>
@@ -1172,7 +1142,7 @@
     </w:p>
     <w:p>
       <w:pPr>
-        <w:pStyle w:val="Heading2"/>
+        <w:pStyle w:val="Heading3"/>
       </w:pPr>
       <w:r>
         <w:t>What BD can sell now</w:t>
@@ -1190,7 +1160,7 @@
     </w:p>
     <w:p>
       <w:pPr>
-        <w:pStyle w:val="Heading2"/>
+        <w:pStyle w:val="Heading3"/>
       </w:pPr>
       <w:r>
         <w:t>What BD must not oversell</w:t>
@@ -1208,7 +1178,7 @@
     </w:p>
     <w:p>
       <w:pPr>
-        <w:pStyle w:val="Heading2"/>
+        <w:pStyle w:val="Heading3"/>
       </w:pPr>
       <w:r>
         <w:t>Best first sales motion</w:t>
@@ -1263,7 +1233,7 @@
     </w:p>
     <w:p>
       <w:pPr>
-        <w:pStyle w:val="Heading2"/>
+        <w:pStyle w:val="Heading3"/>
       </w:pPr>
       <w:r>
         <w:t>Required onboarding information from a customer</w:t>
@@ -1462,7 +1432,7 @@
     </w:p>
     <w:p>
       <w:pPr>
-        <w:pStyle w:val="Heading2"/>
+        <w:pStyle w:val="Heading3"/>
       </w:pPr>
       <w:r>
         <w:t>Public announcement wording</w:t>
@@ -1475,12 +1445,9 @@
     </w:p>
     <w:p>
       <w:pPr>
-        <w:ind w:left="360"/>
-      </w:pPr>
-      <w:r>
-        <w:rPr>
-          <w:i/>
-        </w:rPr>
+        <w:pStyle w:val="Quote"/>
+      </w:pPr>
+      <w:r>
         <w:t>DecaFlow is opening its public beta for Web3 teams that need wallet-risk intelligence, compliance workflows, and continuous contract monitoring. We are onboarding design partners across Verify, Compliance, and Shield while expanding DecaFlow’s proprietary risk graph.</w:t>
       </w:r>
     </w:p>
@@ -1491,12 +1458,9 @@
     </w:p>
     <w:p>
       <w:pPr>
-        <w:ind w:left="360"/>
-      </w:pPr>
-      <w:r>
-        <w:rPr>
-          <w:i/>
-        </w:rPr>
+        <w:pStyle w:val="Quote"/>
+      </w:pPr>
+      <w:r>
         <w:t>DecaFlow is fully complete and detects everything.</w:t>
       </w:r>
     </w:p>
@@ -1507,7 +1471,7 @@
     </w:p>
     <w:p>
       <w:pPr>
-        <w:pStyle w:val="Heading2"/>
+        <w:pStyle w:val="Heading3"/>
       </w:pPr>
       <w:r>
         <w:t>BD checklist before outreach blast</w:t>
@@ -1563,7 +1527,7 @@
     </w:p>
     <w:p>
       <w:pPr>
-        <w:pStyle w:val="Heading1"/>
+        <w:pStyle w:val="Heading2"/>
       </w:pPr>
       <w:r>
         <w:t>Immediate hardening update — 2026-08-08</w:t>
@@ -1581,12 +1545,9 @@
     </w:p>
     <w:p>
       <w:pPr>
-        <w:ind w:left="360"/>
-      </w:pPr>
-      <w:r>
-        <w:rPr>
-          <w:i/>
-        </w:rPr>
+        <w:pStyle w:val="Quote"/>
+      </w:pPr>
+      <w:r>
         <w:t>Give DecaFlow 1–5 important contracts on one chain. We will monitor activity, admin/proxy changes, approval/transfer signals, code-hash changes, and incident workflow outcomes, then tune alerts with your team before expanding coverage.</w:t>
       </w:r>
     </w:p>
@@ -1597,12 +1558,9 @@
     </w:p>
     <w:p>
       <w:pPr>
-        <w:ind w:left="360"/>
-      </w:pPr>
-      <w:r>
-        <w:rPr>
-          <w:i/>
-        </w:rPr>
+        <w:pStyle w:val="Quote"/>
+      </w:pPr>
+      <w:r>
         <w:t>DecaFlow’s authenticated production checks use DecaFlow-owned risk labels, public sanctions ingestion, curated labels, Alchemy graph ingestion, scoring calibration, and analyst feedback. Public website demos are previews; production API checks are the compliance workflow surface.</w:t>
       </w:r>
     </w:p>
@@ -1613,7 +1571,7 @@
     </w:p>
     <w:p>
       <w:pPr>
-        <w:pStyle w:val="Heading1"/>
+        <w:pStyle w:val="Heading2"/>
       </w:pPr>
       <w:r>
         <w:t>Operations note for BD</w:t>
@@ -1626,7 +1584,7 @@
     </w:p>
     <w:p>
       <w:pPr>
-        <w:pStyle w:val="Heading1"/>
+        <w:pStyle w:val="Heading2"/>
       </w:pPr>
       <w:r>
         <w:t>Post-run review update</w:t>
@@ -1639,7 +1597,7 @@
     </w:p>
     <w:p>
       <w:pPr>
-        <w:pStyle w:val="Heading1"/>
+        <w:pStyle w:val="Heading2"/>
       </w:pPr>
       <w:r>
         <w:t>Checkout, product controls, and brand update — 2026-08-08</w:t>
@@ -1694,7 +1652,6 @@
       <w:r>
         <w:rPr>
           <w:rFonts w:ascii="Courier New" w:hAnsi="Courier New"/>
-          <w:sz w:val="18"/>
         </w:rPr>
         <w:t>/founder-control</w:t>
       </w:r>
@@ -1709,7 +1666,7 @@
     </w:p>
     <w:p>
       <w:pPr>
-        <w:pStyle w:val="Heading1"/>
+        <w:pStyle w:val="Heading2"/>
       </w:pPr>
       <w:r>
         <w:t>Risk coverage and enterprise-auth update — 2026-08-09</w:t>
@@ -1727,12 +1684,9 @@
     </w:p>
     <w:p>
       <w:pPr>
-        <w:ind w:left="360"/>
-      </w:pPr>
-      <w:r>
-        <w:rPr>
-          <w:i/>
-        </w:rPr>
+        <w:pStyle w:val="Quote"/>
+      </w:pPr>
+      <w:r>
         <w:t>DecaFlow runs its own internal wallet-risk engine. It combines sanctions labels, public scam/phishing feeds, curated incident labels, graph exposure, calibration cases, and analyst review feedback into approve/review/reject decisions for compliance workflows.</w:t>
       </w:r>
     </w:p>
@@ -1743,12 +1697,9 @@
     </w:p>
     <w:p>
       <w:pPr>
-        <w:ind w:left="360"/>
-      </w:pPr>
-      <w:r>
-        <w:rPr>
-          <w:i/>
-        </w:rPr>
+        <w:pStyle w:val="Quote"/>
+      </w:pPr>
+      <w:r>
         <w:t>The latest production ingestion run loaded thousands of public scam/phishing labels into DecaFlow’s own risk database, including ScamSniffer and MyEtherWallet darklist sources, and calibration passed against known sanctioned, mixer, and exploit-linked wallets.</w:t>
       </w:r>
     </w:p>
@@ -1788,18 +1739,15 @@
     </w:p>
     <w:p>
       <w:pPr>
-        <w:ind w:left="360"/>
-      </w:pPr>
-      <w:r>
-        <w:rPr>
-          <w:i/>
-        </w:rPr>
+        <w:pStyle w:val="Quote"/>
+      </w:pPr>
+      <w:r>
         <w:t>DecaFlow owns the engine and is rapidly expanding the dataset. Early customers help shape coverage by bringing real wallets, contracts, incidents, and expected decisions into the feedback loop.</w:t>
       </w:r>
     </w:p>
     <w:p>
       <w:pPr>
-        <w:pStyle w:val="Heading2"/>
+        <w:pStyle w:val="Heading3"/>
       </w:pPr>
       <w:r>
         <w:t>Updated Agents positioning</w:t>
@@ -1817,12 +1765,9 @@
     </w:p>
     <w:p>
       <w:pPr>
-        <w:ind w:left="360"/>
-      </w:pPr>
-      <w:r>
-        <w:rPr>
-          <w:i/>
-        </w:rPr>
+        <w:pStyle w:val="Quote"/>
+      </w:pPr>
+      <w:r>
         <w:t>DecaFlow Agents turns wallet-risk checks into accountable workflows. Teams define rules, route flagged cases into review queues, record decisions, and can later approve specific repeated patterns for automation under named human ownership.</w:t>
       </w:r>
     </w:p>
@@ -1833,18 +1778,15 @@
     </w:p>
     <w:p>
       <w:pPr>
-        <w:ind w:left="360"/>
-      </w:pPr>
-      <w:r>
-        <w:rPr>
-          <w:i/>
-        </w:rPr>
+        <w:pStyle w:val="Quote"/>
+      </w:pPr>
+      <w:r>
         <w:t>Agents does not blindly freeze or move anything. It supports human-approved workflow automation with role-scoped organization access and auditability.</w:t>
       </w:r>
     </w:p>
     <w:p>
       <w:pPr>
-        <w:pStyle w:val="Heading2"/>
+        <w:pStyle w:val="Heading3"/>
       </w:pPr>
       <w:r>
         <w:t>What to ask pilots for now</w:t>
@@ -1899,7 +1841,7 @@
     </w:p>
     <w:p>
       <w:pPr>
-        <w:pStyle w:val="Heading1"/>
+        <w:pStyle w:val="Heading2"/>
       </w:pPr>
       <w:r>
         <w:t>Product playbook and rebrand — 2026-08-09</w:t>
@@ -1907,7 +1849,7 @@
     </w:p>
     <w:p>
       <w:pPr>
-        <w:pStyle w:val="Heading2"/>
+        <w:pStyle w:val="Heading3"/>
       </w:pPr>
       <w:r>
         <w:t>Rebrand</w:t>
@@ -1929,7 +1871,7 @@
     </w:p>
     <w:p>
       <w:pPr>
-        <w:pStyle w:val="Heading2"/>
+        <w:pStyle w:val="Heading3"/>
       </w:pPr>
       <w:r>
         <w:t>Step-by-step per product (what the customer actually does)</w:t>
@@ -1946,17 +1888,25 @@
         <w:t>Verify API</w:t>
       </w:r>
       <w:r>
-        <w:t xml:space="preserve">: pay → receive API key → call </w:t>
+        <w:t xml:space="preserve">: pay → receive API key and login link → run screenings from </w:t>
       </w:r>
       <w:r>
         <w:rPr>
           <w:rFonts w:ascii="Courier New" w:hAnsi="Courier New"/>
-          <w:sz w:val="18"/>
+        </w:rPr>
+        <w:t>/account</w:t>
+      </w:r>
+      <w:r>
+        <w:t xml:space="preserve"> or call </w:t>
+      </w:r>
+      <w:r>
+        <w:rPr>
+          <w:rFonts w:ascii="Courier New" w:hAnsi="Courier New"/>
         </w:rPr>
         <w:t>POST /v1/verify/check</w:t>
       </w:r>
       <w:r>
-        <w:t xml:space="preserve"> from their backend → get approve/review/reject with evidence. Demo on the site is clearly a preview; the API is the product.</w:t>
+        <w:t xml:space="preserve"> from their backend → get approve/review/reject with evidence. Demo on the site is clearly a preview; the authenticated dashboard/API is the product.</w:t>
       </w:r>
     </w:p>
     <w:p>
@@ -1984,7 +1934,16 @@
         <w:t>Shield</w:t>
       </w:r>
       <w:r>
-        <w:t>: pay → send us chains, contract addresses, alert emails, and contract ABIs → monitoring live in 15-minute cycles with alerts, incidents, playbooks, and ABI-aware privileged-function findings.</w:t>
+        <w:t xml:space="preserve">: pay → add watched contracts from </w:t>
+      </w:r>
+      <w:r>
+        <w:rPr>
+          <w:rFonts w:ascii="Courier New" w:hAnsi="Courier New"/>
+        </w:rPr>
+        <w:t>/account</w:t>
+      </w:r>
+      <w:r>
+        <w:t xml:space="preserve"> or send DecaFlow the chains, contract addresses, alert emails, and contract ABIs → monitoring live in 15-minute cycles with alerts, incidents, playbooks, and ABI-aware privileged-function findings.</w:t>
       </w:r>
     </w:p>
     <w:p>
@@ -1998,7 +1957,16 @@
         <w:t>Autopilot</w:t>
       </w:r>
       <w:r>
-        <w:t>: pay → org account and scoped API key → set rules → review queue → approve automation for proven patterns only.</w:t>
+        <w:t xml:space="preserve">: pay → org account and scoped API key → create rules from </w:t>
+      </w:r>
+      <w:r>
+        <w:rPr>
+          <w:rFonts w:ascii="Courier New" w:hAnsi="Courier New"/>
+        </w:rPr>
+        <w:t>/account</w:t>
+      </w:r>
+      <w:r>
+        <w:t xml:space="preserve"> or API → review queue → approve/reject queue items → approve automation for proven patterns only.</w:t>
       </w:r>
     </w:p>
     <w:p>
@@ -2012,7 +1980,16 @@
         <w:t>Institutional/RWA</w:t>
       </w:r>
       <w:r>
-        <w:t>: issuer engagement → org API key with attestation/check scopes → they record ZK-KYC attestations, run investor checks before every mint/transfer, and deploy DecaFlow's pre-audited templates with their own multisig and counsel.</w:t>
+        <w:t xml:space="preserve">: issuer engagement → org API key with attestation/check scopes → they record ZK-KYC attestations from </w:t>
+      </w:r>
+      <w:r>
+        <w:rPr>
+          <w:rFonts w:ascii="Courier New" w:hAnsi="Courier New"/>
+        </w:rPr>
+        <w:t>/account</w:t>
+      </w:r>
+      <w:r>
+        <w:t xml:space="preserve"> or API, run investor checks before every mint/transfer, and deploy DecaFlow's pre-audited templates with their own multisig and counsel.</w:t>
       </w:r>
     </w:p>
     <w:p>
@@ -2031,7 +2008,7 @@
     </w:p>
     <w:p>
       <w:pPr>
-        <w:pStyle w:val="Heading2"/>
+        <w:pStyle w:val="Heading3"/>
       </w:pPr>
       <w:r>
         <w:t>Customer login story (use in demos)</w:t>
@@ -2039,18 +2016,28 @@
     </w:p>
     <w:p>
       <w:r>
-        <w:t>Every customer gets passwordless login at decaflow.xyz/login: email link → account page → team, API keys, all products in one place. Buying another product uses the same account email, so access accumulates under one organization.</w:t>
+        <w:t>Every customer gets passwordless login at decaflow.xyz/login: email link → account page → team, API keys, and interactive dashboards for the products they bought. Buying another product uses the same account email, so access accumulates under one organization.</w:t>
       </w:r>
     </w:p>
     <w:p>
-      <w:pPr>
-        <w:pStyle w:val="Heading2"/>
-      </w:pPr>
-      <w:r>
-        <w:t>What BD owns operationally</w:t>
+      <w:r>
+        <w:t>The account page is not meant to look empty. A paid customer can take real actions from it: run Verify screenings, add Shield watched contracts, create Autopilot rules, approve/reject Autopilot review items, record Institutional/RWA identity attestations, and run investor eligibility checks. Compliance and Audit customers see their engagement status there, while delivery still involves the operator/team follow-up described below.</w:t>
       </w:r>
     </w:p>
     <w:p>
+      <w:r>
+        <w:t>Founder test accounts created from founder-control are special preview accounts. New founder test accounts unlock all dashboards and include sample data at creation — a Shield watched contract, Autopilot rules and queue items, Verify screenings, and Institutional attestation/checks — so demos look like a customer with real usage. Old founder test accounts made before the seeded-dashboard change may still look sparse; recreate them or use the new forms to populate them.</w:t>
+      </w:r>
+    </w:p>
+    <w:p>
+      <w:pPr>
+        <w:pStyle w:val="Heading3"/>
+      </w:pPr>
+      <w:r>
+        <w:t>What BD owns operationally</w:t>
+      </w:r>
+    </w:p>
+    <w:p>
       <w:pPr>
         <w:pStyle w:val="ListBullet"/>
       </w:pPr>
@@ -2060,7 +2047,6 @@
       <w:r>
         <w:rPr>
           <w:rFonts w:ascii="Courier New" w:hAnsi="Courier New"/>
-          <w:sz w:val="18"/>
         </w:rPr>
         <w:t>accepting customers</w:t>
       </w:r>
@@ -2094,7 +2080,7 @@
     </w:p>
     <w:sectPr>
       <w:pgSz w:w="12240" w:h="15840"/>
-      <w:pgMar w:top="1008" w:right="1080" w:bottom="1008" w:left="1080" w:header="720" w:footer="720" w:gutter="0"/>
+      <w:pgMar w:top="1440" w:right="1800" w:bottom="1440" w:left="1800" w:header="720" w:footer="720" w:gutter="0"/>
       <w:cols w:space="720"/>
       <w:docGrid w:linePitch="360"/>
     </w:sectPr>
@@ -2465,10 +2451,6 @@
     <w:name w:val="Normal"/>
     <w:qFormat/>
     <w:rsid w:val="00FC693F"/>
-    <w:rPr>
-      <w:rFonts w:ascii="Aptos" w:hAnsi="Aptos"/>
-      <w:sz w:val="21"/>
-    </w:rPr>
   </w:style>
   <w:style w:type="paragraph" w:styleId="Header">
     <w:name w:val="header"/>
@@ -2529,11 +2511,11 @@
       <w:outlineLvl w:val="0"/>
     </w:pPr>
     <w:rPr>
-      <w:rFonts w:asciiTheme="majorHAnsi" w:eastAsiaTheme="majorEastAsia" w:hAnsiTheme="majorHAnsi" w:cstheme="majorBidi" w:ascii="Aptos Display" w:hAnsi="Aptos Display"/>
+      <w:rFonts w:asciiTheme="majorHAnsi" w:eastAsiaTheme="majorEastAsia" w:hAnsiTheme="majorHAnsi" w:cstheme="majorBidi"/>
       <w:b/>
       <w:bCs/>
       <w:color w:val="365F91" w:themeColor="accent1" w:themeShade="BF"/>
-      <w:sz w:val="32"/>
+      <w:sz w:val="28"/>
       <w:szCs w:val="28"/>
     </w:rPr>
   </w:style>
@@ -2553,7 +2535,7 @@
       <w:outlineLvl w:val="1"/>
     </w:pPr>
     <w:rPr>
-      <w:rFonts w:asciiTheme="majorHAnsi" w:eastAsiaTheme="majorEastAsia" w:hAnsiTheme="majorHAnsi" w:cstheme="majorBidi" w:ascii="Aptos Display" w:hAnsi="Aptos Display"/>
+      <w:rFonts w:asciiTheme="majorHAnsi" w:eastAsiaTheme="majorEastAsia" w:hAnsiTheme="majorHAnsi" w:cstheme="majorBidi"/>
       <w:b/>
       <w:bCs/>
       <w:color w:val="4F81BD" w:themeColor="accent1"/>
@@ -2577,11 +2559,10 @@
       <w:outlineLvl w:val="2"/>
     </w:pPr>
     <w:rPr>
-      <w:rFonts w:asciiTheme="majorHAnsi" w:eastAsiaTheme="majorEastAsia" w:hAnsiTheme="majorHAnsi" w:cstheme="majorBidi" w:ascii="Aptos Display" w:hAnsi="Aptos Display"/>
+      <w:rFonts w:asciiTheme="majorHAnsi" w:eastAsiaTheme="majorEastAsia" w:hAnsiTheme="majorHAnsi" w:cstheme="majorBidi"/>
       <w:b/>
       <w:bCs/>
       <w:color w:val="4F81BD" w:themeColor="accent1"/>
-      <w:sz w:val="23"/>
     </w:rPr>
   </w:style>
   <w:style w:type="paragraph" w:styleId="Heading4">
@@ -2819,11 +2800,11 @@
       <w:contextualSpacing/>
     </w:pPr>
     <w:rPr>
-      <w:rFonts w:asciiTheme="majorHAnsi" w:eastAsiaTheme="majorEastAsia" w:hAnsiTheme="majorHAnsi" w:cstheme="majorBidi" w:ascii="Aptos Display" w:hAnsi="Aptos Display"/>
+      <w:rFonts w:asciiTheme="majorHAnsi" w:eastAsiaTheme="majorEastAsia" w:hAnsiTheme="majorHAnsi" w:cstheme="majorBidi"/>
       <w:color w:val="17365D" w:themeColor="text2" w:themeShade="BF"/>
       <w:spacing w:val="5"/>
       <w:kern w:val="28"/>
-      <w:sz w:val="40"/>
+      <w:sz w:val="52"/>
       <w:szCs w:val="52"/>
     </w:rPr>
   </w:style>
@@ -14152,6 +14133,13 @@
         <w:shd w:val="clear" w:color="auto" w:fill="FBCAA2" w:themeFill="accent6" w:themeFillTint="7F"/>
       </w:tcPr>
     </w:tblStylePr>
+  </w:style>
+  <w:style w:type="paragraph" w:customStyle="1" w:styleId="CodeBlock">
+    <w:name w:val="CodeBlock"/>
+    <w:rPr>
+      <w:rFonts w:ascii="Courier New" w:hAnsi="Courier New"/>
+      <w:sz w:val="18"/>
+    </w:rPr>
   </w:style>
 </w:styles>
 </file>

</xml_diff>